<commit_message>
Land the repair round of step 3 of plan 3
- The review agent prompt of /writing checks section, first-sentence and whole-draft rules and names every rule a passage breaks.
- The case files rewritten so their clean passages break no rule, with ten fixes at landing.
- Booking: Step 3, the repair round (landed 2026-10-15), in plan.md.
</commit_message>
<xml_diff>
--- a/.scratch/3-the-writing-base/cases/engineering/draft.docx
+++ b/.scratch/3-the-writing-base/cases/engineering/draft.docx
@@ -28,7 +28,7 @@
           <w:sz-cs w:val="24"/>
           <w:spacing w:val="0"/>
         </w:rPr>
-        <w:t xml:space="preserve">We compare a fixed worker pool with a growing worker pool for bounded task queues in server software. On four hosts the fixed pool raised throughput by 24 percent and lowered the 99th percentile latency from 410 to 190 microseconds.</w:t>
+        <w:t xml:space="preserve">We compare a fixed worker pool with a growing worker pool for bounded task queues in server software. On four hosts the fixed pool raised throughput by 24 percent. It lowered the 99th percentile latency, the latency that 99 percent of tasks stayed below, from 410 to 190 microseconds.</w:t>
       </w:r>
     </w:p>
     <w:p>
@@ -184,7 +184,7 @@
           <w:sz-cs w:val="24"/>
           <w:spacing w:val="0"/>
         </w:rPr>
-        <w:t xml:space="preserve">The correctness proof of this design fits into two pages (Jones, 2020).</w:t>
+        <w:t xml:space="preserve">A correctness proof of this design exists (Jones, 2020), so this study measures only its performance.</w:t>
       </w:r>
     </w:p>
     <w:p>
@@ -298,7 +298,7 @@
           <w:sz-cs w:val="24"/>
           <w:spacing w:val="0"/>
         </w:rPr>
-        <w:t xml:space="preserve">The fixed pool started 64 worker threads at launch. The growing pool started 8 threads and added one thread whenever the queue held more than 2048 tasks.</w:t>
+        <w:t xml:space="preserve">The fixed pool created 64 worker threads at launch. The growing pool created 8 threads and created one more thread whenever the queue held more than 2048 tasks.</w:t>
       </w:r>
     </w:p>
     <w:p>
@@ -480,7 +480,7 @@
           <w:sz-cs w:val="24"/>
           <w:spacing w:val="0"/>
         </w:rPr>
-        <w:t xml:space="preserve">In recent years, hosts gained cores, so the pool sizes of this study started at 8 and 64 threads. Both starting sizes stayed below the core count of the smallest host.</w:t>
+        <w:t xml:space="preserve">In recent years, hosts gained cores, so the thread counts of this study started at 8 and 64. Neither count reached the core count of the smallest host.</w:t>
       </w:r>
     </w:p>
     <w:p>
@@ -508,7 +508,7 @@
           <w:sz-cs w:val="24"/>
           <w:spacing w:val="0"/>
         </w:rPr>
-        <w:t xml:space="preserve">Outputs: tasks per second and tail latency.</w:t>
+        <w:t xml:space="preserve">Outputs: tasks per second and 99th percentile latency.</w:t>
       </w:r>
     </w:p>
     <w:p>
@@ -649,7 +649,7 @@
           <w:sz-cs w:val="24"/>
           <w:spacing w:val="0"/>
         </w:rPr>
-        <w:t xml:space="preserve">The harness covered only x86 hosts, so the results do not extend to other architectures. All four hosts used processors from one vendor.</w:t>
+        <w:t xml:space="preserve">The harness covered only x86 hosts, which limited the results to that architecture. All four hosts used processors from one vendor.</w:t>
       </w:r>
     </w:p>
     <w:p>
@@ -902,35 +902,35 @@
           <w:sz-cs w:val="24"/>
           <w:spacing w:val="0"/>
         </w:rPr>
-        <w:t xml:space="preserve">The growing pool created 248 threads during each run. Creating them therefore took 6 percent of each run. Thread creation alone thus explains only part of the 24 percent gap.</w:t>
-      </w:r>
-    </w:p>
-    <w:p>
-      <w:pPr>
-        <w:spacing w:after="240"/>
-      </w:pPr>
-      <w:r>
-        <w:rPr>
-          <w:rFonts w:ascii="Times" w:hAnsi="Times" w:cs="Times"/>
-          <w:sz w:val="24"/>
-          <w:sz-cs w:val="24"/>
-          <w:spacing w:val="0"/>
-        </w:rPr>
-        <w:t xml:space="preserve">The gain ranged from 22 percent on the first host to 27 percent on the fourth host. It held on all four hosts.</w:t>
-      </w:r>
-    </w:p>
-    <w:p>
-      <w:pPr>
-        <w:spacing w:after="240"/>
-      </w:pPr>
-      <w:r>
-        <w:rPr>
-          <w:rFonts w:ascii="Times" w:hAnsi="Times" w:cs="Times"/>
-          <w:sz w:val="24"/>
-          <w:sz-cs w:val="24"/>
-          <w:spacing w:val="0"/>
-        </w:rPr>
-        <w:t xml:space="preserve">The throughput of the fixed pool on the fourth host, the host with the most cores of the four, was the highest value that any run of the study produced. A fixed pool may therefore scale with the core count of its host.</w:t>
+        <w:t xml:space="preserve">Thread creation explained only part of the 24 percent gap. The growing pool created 248 threads during each run. Each creation took 15 milliseconds. Creating the threads therefore took 3.7 seconds, 6 percent of each 60-second run, a quarter of the gap.</w:t>
+      </w:r>
+    </w:p>
+    <w:p>
+      <w:pPr>
+        <w:spacing w:after="240"/>
+      </w:pPr>
+      <w:r>
+        <w:rPr>
+          <w:rFonts w:ascii="Times" w:hAnsi="Times" w:cs="Times"/>
+          <w:sz w:val="24"/>
+          <w:sz-cs w:val="24"/>
+          <w:spacing w:val="0"/>
+        </w:rPr>
+        <w:t xml:space="preserve">The gain ranged from 22 percent on the first host to 27 percent on the fourth host. Since every host gained at least 22 percent, the effect did not depend on a single host.</w:t>
+      </w:r>
+    </w:p>
+    <w:p>
+      <w:pPr>
+        <w:spacing w:after="240"/>
+      </w:pPr>
+      <w:r>
+        <w:rPr>
+          <w:rFonts w:ascii="Times" w:hAnsi="Times" w:cs="Times"/>
+          <w:sz w:val="24"/>
+          <w:sz-cs w:val="24"/>
+          <w:spacing w:val="0"/>
+        </w:rPr>
+        <w:t xml:space="preserve">The throughput of the fixed pool on the fourth host, the host with the most cores of the four, was the highest value that any run of the study produced, which suggested that a fixed pool scales with the core count of its host.</w:t>
       </w:r>
     </w:p>
     <w:p>
@@ -1099,7 +1099,7 @@
           <w:sz-cs w:val="24"/>
           <w:spacing w:val="0"/>
         </w:rPr>
-        <w:t xml:space="preserve">Only one queue size was tested, which limited the latency result to that size.</w:t>
+        <w:t xml:space="preserve">Only one queue depth was tested, which limited the latency result to that depth.</w:t>
       </w:r>
     </w:p>
     <w:p>
@@ -1142,7 +1142,7 @@
           <w:sz-cs w:val="24"/>
           <w:spacing w:val="0"/>
         </w:rPr>
-        <w:t xml:space="preserve">The fixed pool lowered the 99th percentile latency from 410 to 190 microseconds. The result confirms, for these hosts, the expectation that a fixed pool lowers the tail.</w:t>
+        <w:t xml:space="preserve">The fixed pool lowered the 99th percentile latency from 410 to 190 microseconds. The result confirmed, for these hosts, the expectation that a fixed pool lowers the tail.</w:t>
       </w:r>
     </w:p>
     <w:p>
@@ -1185,7 +1185,7 @@
           <w:sz-cs w:val="24"/>
           <w:spacing w:val="0"/>
         </w:rPr>
-        <w:t xml:space="preserve">The study adds what the earlier queue studies left unmeasured: the fixed pool lowered the tail latency on every host. Why does a fixed pool lower the tail latency? The results suggest that a fixed pool lowers tail latency by removing thread creation from the request path.</w:t>
+        <w:t xml:space="preserve">The study adds what the earlier queue studies left unmeasured: the fixed pool lowered the 99th percentile latency on every host. Why does a fixed pool lower the 99th percentile latency? The results suggest that a fixed pool lowers the 99th percentile latency by removing thread creation from the request path.</w:t>
       </w:r>
     </w:p>
     <w:p>
@@ -1311,7 +1311,7 @@
           <w:sz-cs w:val="24"/>
           <w:spacing w:val="0"/>
         </w:rPr>
-        <w:t xml:space="preserve">The fixed pool allocates all 64 threads at launch, which removes thread creation from the request path. The growing pool allocates its threads one at a time.</w:t>
+        <w:t xml:space="preserve">The fixed pool creates all 64 threads at launch, which removes thread creation from the request path. The growing pool creates its threads one at a time.</w:t>
       </w:r>
     </w:p>
     <w:p>
@@ -1801,7 +1801,7 @@
           <w:sz-cs w:val="24"/>
           <w:spacing w:val="0"/>
         </w:rPr>
-        <w:t xml:space="preserve">The harness records each task twice. It stamps the submission time on entry. It stamps the completion time on exit. The host also reports memory use once per second. The harness writes the report after the run. A summary file holds the totals.</w:t>
+        <w:t xml:space="preserve">The harness records each task twice. It stamps the submission time on entry. It stamps the completion time on exit. The host also reports memory use once per second, and a separate file keeps every sample. The harness writes the report after the run. A summary file holds the totals.</w:t>
       </w:r>
     </w:p>
     <w:p>
@@ -1843,7 +1843,7 @@
           <w:sz-cs w:val="24"/>
           <w:spacing w:val="0"/>
         </w:rPr>
-        <w:t xml:space="preserve">We chose to report the 99th percentile because it exposes queueing delay. The 99th percentile is the latency that 99 percent of the tasks stayed below.</w:t>
+        <w:t xml:space="preserve">We chose to report the 99th percentile because it exposes queueing delay. The 99th percentile is the latency that 99 percent of the tasks stay below.</w:t>
       </w:r>
     </w:p>
     <w:p>
@@ -2135,7 +2135,7 @@
           <w:sz-cs w:val="24"/>
           <w:spacing w:val="0"/>
         </w:rPr>
-        <w:t xml:space="preserve">The pool size of 64 stayed below the 96 cores of the smallest host. The producers and the queue therefore kept cores of their own.</w:t>
+        <w:t xml:space="preserve">The thread count of 64 stays below the 96 cores of the smallest host. The producers and the queue therefore keep cores of their own.</w:t>
       </w:r>
     </w:p>
     <w:p>

</xml_diff>